<commit_message>
Updated project output file
</commit_message>
<xml_diff>
--- a/Project/Project-Part1/Python_Cafe_Output.docx
+++ b/Project/Project-Part1/Python_Cafe_Output.docx
@@ -32,115 +32,6 @@
                     <a:xfrm>
                       <a:off x="0" y="0"/>
                       <a:ext cx="6311900" cy="4362450"/>
-                    </a:xfrm>
-                    <a:prstGeom prst="rect">
-                      <a:avLst/>
-                    </a:prstGeom>
-                  </pic:spPr>
-                </pic:pic>
-              </a:graphicData>
-            </a:graphic>
-          </wp:inline>
-        </w:drawing>
-      </w:r>
-      <w:r>
-        <w:br w:type="page"/>
-      </w:r>
-    </w:p>
-    <w:p>
-      <w:pPr>
-        <w:pStyle w:val="Heading2"/>
-      </w:pPr>
-      <w:r>
-        <w:lastRenderedPageBreak/>
-        <w:t>Program output — section 2</w:t>
-      </w:r>
-    </w:p>
-    <w:p>
-      <w:r>
-        <w:rPr>
-          <w:noProof/>
-        </w:rPr>
-        <w:drawing>
-          <wp:inline distT="0" distB="0" distL="0" distR="0" wp14:anchorId="66456A75" wp14:editId="1011EFF6">
-            <wp:extent cx="5760720" cy="6036754"/>
-            <wp:effectExtent l="0" t="0" r="0" b="0"/>
-            <wp:docPr id="2" name="Picture 2"/>
-            <wp:cNvGraphicFramePr>
-              <a:graphicFrameLocks xmlns:a="http://schemas.openxmlformats.org/drawingml/2006/main" noChangeAspect="1"/>
-            </wp:cNvGraphicFramePr>
-            <a:graphic xmlns:a="http://schemas.openxmlformats.org/drawingml/2006/main">
-              <a:graphicData uri="http://schemas.openxmlformats.org/drawingml/2006/picture">
-                <pic:pic xmlns:pic="http://schemas.openxmlformats.org/drawingml/2006/picture">
-                  <pic:nvPicPr>
-                    <pic:cNvPr id="0" name="run_screenshot_2.png"/>
-                    <pic:cNvPicPr/>
-                  </pic:nvPicPr>
-                  <pic:blipFill>
-                    <a:blip r:embed="rId7"/>
-                    <a:stretch>
-                      <a:fillRect/>
-                    </a:stretch>
-                  </pic:blipFill>
-                  <pic:spPr>
-                    <a:xfrm>
-                      <a:off x="0" y="0"/>
-                      <a:ext cx="5760720" cy="6036754"/>
-                    </a:xfrm>
-                    <a:prstGeom prst="rect">
-                      <a:avLst/>
-                    </a:prstGeom>
-                  </pic:spPr>
-                </pic:pic>
-              </a:graphicData>
-            </a:graphic>
-          </wp:inline>
-        </w:drawing>
-      </w:r>
-    </w:p>
-    <w:p>
-      <w:r>
-        <w:br w:type="page"/>
-      </w:r>
-    </w:p>
-    <w:p>
-      <w:pPr>
-        <w:pStyle w:val="Heading2"/>
-      </w:pPr>
-      <w:r>
-        <w:t>Program output — section 3</w:t>
-      </w:r>
-    </w:p>
-    <w:p>
-      <w:r>
-        <w:rPr>
-          <w:noProof/>
-        </w:rPr>
-        <w:drawing>
-          <wp:inline distT="0" distB="0" distL="0" distR="0" wp14:anchorId="1B2F6199" wp14:editId="03BFEB06">
-            <wp:extent cx="5760720" cy="1356170"/>
-            <wp:effectExtent l="0" t="0" r="0" b="0"/>
-            <wp:docPr id="3" name="Picture 3"/>
-            <wp:cNvGraphicFramePr>
-              <a:graphicFrameLocks xmlns:a="http://schemas.openxmlformats.org/drawingml/2006/main" noChangeAspect="1"/>
-            </wp:cNvGraphicFramePr>
-            <a:graphic xmlns:a="http://schemas.openxmlformats.org/drawingml/2006/main">
-              <a:graphicData uri="http://schemas.openxmlformats.org/drawingml/2006/picture">
-                <pic:pic xmlns:pic="http://schemas.openxmlformats.org/drawingml/2006/picture">
-                  <pic:nvPicPr>
-                    <pic:cNvPr id="0" name="run_screenshot_3.png"/>
-                    <pic:cNvPicPr/>
-                  </pic:nvPicPr>
-                  <pic:blipFill>
-                    <a:blip r:embed="rId8"/>
-                    <a:stretch>
-                      <a:fillRect/>
-                    </a:stretch>
-                  </pic:blipFill>
-                  <pic:spPr>
-                    <a:xfrm>
-                      <a:off x="0" y="0"/>
-                      <a:ext cx="5760720" cy="1356170"/>
                     </a:xfrm>
                     <a:prstGeom prst="rect">
                       <a:avLst/>

</xml_diff>